<commit_message>
Update to 3.2 assignment
</commit_message>
<xml_diff>
--- a/module-3/Sengvanhpheng_Assignment3_2.docx
+++ b/module-3/Sengvanhpheng_Assignment3_2.docx
@@ -15,7 +15,11 @@
       </w:r>
       <w:r>
         <w:rPr/>
-        <w:t xml:space="preserve">18, </w:t>
+        <w:t>20</w:t>
+      </w:r>
+      <w:r>
+        <w:rPr/>
+        <w:t xml:space="preserve">, </w:t>
       </w:r>
       <w:r>
         <w:rPr/>
@@ -636,14 +640,63 @@
           <w:sz w:val="24"/>
           <w:szCs w:val="24"/>
         </w:rPr>
-        <w:t xml:space="preserve">_ID  used for unique identification. </w:t>
-      </w:r>
-      <w:r>
-        <w:rPr>
-          <w:sz w:val="24"/>
-          <w:szCs w:val="24"/>
-        </w:rPr>
-        <w:t>Publisher_name</w:t>
+        <w:t>_ID</w:t>
+      </w:r>
+      <w:r>
+        <w:rPr>
+          <w:sz w:val="24"/>
+          <w:szCs w:val="24"/>
+        </w:rPr>
+        <w:t xml:space="preserve">  </w:t>
+      </w:r>
+      <w:r>
+        <w:rPr>
+          <w:sz w:val="24"/>
+          <w:szCs w:val="24"/>
+        </w:rPr>
+        <w:t xml:space="preserve">is used as the primary key because it uniquely </w:t>
+      </w:r>
+      <w:r>
+        <w:rPr>
+          <w:sz w:val="24"/>
+          <w:szCs w:val="24"/>
+        </w:rPr>
+        <w:t>identifies</w:t>
+      </w:r>
+      <w:r>
+        <w:rPr>
+          <w:sz w:val="24"/>
+          <w:szCs w:val="24"/>
+        </w:rPr>
+        <w:t xml:space="preserve"> each publisher</w:t>
+      </w:r>
+      <w:r>
+        <w:rPr>
+          <w:sz w:val="24"/>
+          <w:szCs w:val="24"/>
+        </w:rPr>
+        <w:t xml:space="preserve">. </w:t>
+      </w:r>
+      <w:r>
+        <w:rPr>
+          <w:sz w:val="24"/>
+          <w:szCs w:val="24"/>
+        </w:rPr>
+        <w:t>Publisher</w:t>
+      </w:r>
+      <w:r>
+        <w:rPr>
+          <w:sz w:val="24"/>
+          <w:szCs w:val="24"/>
+        </w:rPr>
+        <w:t xml:space="preserve"> </w:t>
+      </w:r>
+      <w:r>
+        <w:rPr>
+          <w:sz w:val="24"/>
+          <w:szCs w:val="24"/>
+        </w:rPr>
+        <w:t>name</w:t>
       </w:r>
       <w:r>
         <w:rPr>
@@ -657,7 +710,7 @@
           <w:sz w:val="24"/>
           <w:szCs w:val="24"/>
         </w:rPr>
-        <w:t>publisher_email</w:t>
+        <w:t>email</w:t>
       </w:r>
       <w:r>
         <w:rPr>
@@ -671,28 +724,42 @@
           <w:sz w:val="24"/>
           <w:szCs w:val="24"/>
         </w:rPr>
-        <w:t>publisher_address</w:t>
-      </w:r>
-      <w:r>
-        <w:rPr>
-          <w:sz w:val="24"/>
-          <w:szCs w:val="24"/>
-        </w:rPr>
-        <w:t xml:space="preserve"> can</w:t>
-      </w:r>
-      <w:r>
-        <w:rPr>
-          <w:sz w:val="24"/>
-          <w:szCs w:val="24"/>
-        </w:rPr>
-        <w:t xml:space="preserve"> have duplicates/ same information</w:t>
-      </w:r>
-      <w:r>
-        <w:rPr>
-          <w:sz w:val="24"/>
-          <w:szCs w:val="24"/>
-        </w:rPr>
-        <w:t>.</w:t>
+        <w:t>address</w:t>
+      </w:r>
+      <w:r>
+        <w:rPr>
+          <w:sz w:val="24"/>
+          <w:szCs w:val="24"/>
+        </w:rPr>
+        <w:t xml:space="preserve"> </w:t>
+      </w:r>
+      <w:r>
+        <w:rPr>
+          <w:sz w:val="24"/>
+          <w:szCs w:val="24"/>
+        </w:rPr>
+        <w:t xml:space="preserve">are </w:t>
+      </w:r>
+      <w:r>
+        <w:rPr>
+          <w:sz w:val="24"/>
+          <w:szCs w:val="24"/>
+        </w:rPr>
+        <w:t>dependant</w:t>
+      </w:r>
+      <w:r>
+        <w:rPr>
+          <w:sz w:val="24"/>
+          <w:szCs w:val="24"/>
+        </w:rPr>
+        <w:t xml:space="preserve"> on </w:t>
+      </w:r>
+      <w:r>
+        <w:rPr>
+          <w:sz w:val="24"/>
+          <w:szCs w:val="24"/>
+        </w:rPr>
+        <w:t>Publisher_ID.</w:t>
       </w:r>
     </w:p>
     <w:p>
@@ -719,7 +786,35 @@
           <w:sz w:val="24"/>
           <w:szCs w:val="24"/>
         </w:rPr>
-        <w:t xml:space="preserve"> can be used for unique identification for BOOKS attributes</w:t>
+        <w:t xml:space="preserve"> can be used </w:t>
+      </w:r>
+      <w:r>
+        <w:rPr>
+          <w:sz w:val="24"/>
+          <w:szCs w:val="24"/>
+        </w:rPr>
+        <w:t xml:space="preserve">as the primary key for BOOKS table because it uniquely </w:t>
+      </w:r>
+      <w:r>
+        <w:rPr>
+          <w:sz w:val="24"/>
+          <w:szCs w:val="24"/>
+        </w:rPr>
+        <w:t>identifies</w:t>
+      </w:r>
+      <w:r>
+        <w:rPr>
+          <w:sz w:val="24"/>
+          <w:szCs w:val="24"/>
+        </w:rPr>
+        <w:t xml:space="preserve"> each book </w:t>
+      </w:r>
+      <w:r>
+        <w:rPr>
+          <w:sz w:val="24"/>
+          <w:szCs w:val="24"/>
+        </w:rPr>
+        <w:t>row.</w:t>
       </w:r>
     </w:p>
     <w:p>
@@ -1367,7 +1462,7 @@
     <w:name w:val="List Paragraph"/>
     <w:basedOn w:val="Normal"/>
     <w:qFormat/>
-    <w:rsid w:val="3311F722"/>
+    <w:rsid w:val="50AE1BE0"/>
     <w:pPr>
       <w:spacing/>
       <w:ind w:left="720"/>

</xml_diff>